<commit_message>
adding in text version and correcting most recent title
</commit_message>
<xml_diff>
--- a/Jerald Sheets Resume - 2025.docx
+++ b/Jerald Sheets Resume - 2025.docx
@@ -284,25 +284,7 @@
             <w:sz w:val="32"/>
             <w:szCs w:val="32"/>
           </w:rPr>
-          <w:t>Portf</w:t>
-        </w:r>
-        <w:r>
-          <w:rPr>
-            <w:rStyle w:val="Hyperlink"/>
-            <w:rFonts w:ascii="Garamond" w:hAnsi="Garamond"/>
-            <w:sz w:val="32"/>
-            <w:szCs w:val="32"/>
-          </w:rPr>
-          <w:t>o</w:t>
-        </w:r>
-        <w:r>
-          <w:rPr>
-            <w:rStyle w:val="Hyperlink"/>
-            <w:rFonts w:ascii="Garamond" w:hAnsi="Garamond"/>
-            <w:sz w:val="32"/>
-            <w:szCs w:val="32"/>
-          </w:rPr>
-          <w:t>lio</w:t>
+          <w:t>Portfolio</w:t>
         </w:r>
       </w:hyperlink>
       <w:r>
@@ -321,25 +303,7 @@
             <w:sz w:val="32"/>
             <w:szCs w:val="32"/>
           </w:rPr>
-          <w:t>Git</w:t>
-        </w:r>
-        <w:r>
-          <w:rPr>
-            <w:rStyle w:val="Hyperlink"/>
-            <w:rFonts w:ascii="Garamond" w:hAnsi="Garamond"/>
-            <w:sz w:val="32"/>
-            <w:szCs w:val="32"/>
-          </w:rPr>
-          <w:t>H</w:t>
-        </w:r>
-        <w:r>
-          <w:rPr>
-            <w:rStyle w:val="Hyperlink"/>
-            <w:rFonts w:ascii="Garamond" w:hAnsi="Garamond"/>
-            <w:sz w:val="32"/>
-            <w:szCs w:val="32"/>
-          </w:rPr>
-          <w:t>ub</w:t>
+          <w:t>GitHub</w:t>
         </w:r>
       </w:hyperlink>
     </w:p>
@@ -398,25 +362,7 @@
             <w:sz w:val="32"/>
             <w:szCs w:val="32"/>
           </w:rPr>
-          <w:t>Link</w:t>
-        </w:r>
-        <w:r>
-          <w:rPr>
-            <w:rStyle w:val="Hyperlink"/>
-            <w:rFonts w:ascii="Garamond" w:hAnsi="Garamond"/>
-            <w:sz w:val="32"/>
-            <w:szCs w:val="32"/>
-          </w:rPr>
-          <w:t>e</w:t>
-        </w:r>
-        <w:r>
-          <w:rPr>
-            <w:rStyle w:val="Hyperlink"/>
-            <w:rFonts w:ascii="Garamond" w:hAnsi="Garamond"/>
-            <w:sz w:val="32"/>
-            <w:szCs w:val="32"/>
-          </w:rPr>
-          <w:t>dIn</w:t>
+          <w:t>LinkedIn</w:t>
         </w:r>
       </w:hyperlink>
     </w:p>
@@ -589,7 +535,34 @@
           <w:i/>
           <w:color w:val="auto"/>
         </w:rPr>
-        <w:t>Sr. HPC Systems Administrator</w:t>
+        <w:t xml:space="preserve">Sr. </w:t>
+      </w:r>
+      <w:r>
+        <w:rPr>
+          <w:rFonts w:ascii="Garamond" w:hAnsi="Garamond"/>
+          <w:bCs/>
+          <w:i/>
+          <w:color w:val="auto"/>
+        </w:rPr>
+        <w:t>Linux</w:t>
+      </w:r>
+      <w:r>
+        <w:rPr>
+          <w:rFonts w:ascii="Garamond" w:hAnsi="Garamond"/>
+          <w:bCs/>
+          <w:i/>
+          <w:color w:val="auto"/>
+        </w:rPr>
+        <w:t xml:space="preserve"> Systems Administrator</w:t>
+      </w:r>
+      <w:r>
+        <w:rPr>
+          <w:rFonts w:ascii="Garamond" w:hAnsi="Garamond"/>
+          <w:bCs/>
+          <w:i/>
+          <w:color w:val="auto"/>
+        </w:rPr>
+        <w:t xml:space="preserve"> - Puppet Automation</w:t>
       </w:r>
       <w:r>
         <w:rPr>
@@ -669,36 +642,16 @@
           <w:i/>
           <w:color w:val="auto"/>
         </w:rPr>
-        <w:tab/>
-      </w:r>
-      <w:r>
-        <w:rPr>
-          <w:rFonts w:ascii="Garamond" w:hAnsi="Garamond"/>
-          <w:bCs/>
-          <w:i/>
-          <w:color w:val="auto"/>
-        </w:rPr>
-        <w:tab/>
-      </w:r>
-      <w:r>
-        <w:rPr>
-          <w:rFonts w:ascii="Garamond" w:hAnsi="Garamond"/>
-          <w:bCs/>
-          <w:i/>
-          <w:color w:val="auto"/>
-        </w:rPr>
-        <w:tab/>
-        <w:t xml:space="preserve">     </w:t>
-      </w:r>
-      <w:r>
-        <w:rPr>
-          <w:rFonts w:ascii="Garamond" w:hAnsi="Garamond"/>
-          <w:bCs/>
-          <w:i/>
-          <w:color w:val="auto"/>
-        </w:rPr>
-        <w:tab/>
-        <w:t xml:space="preserve"> Remote</w:t>
+        <w:br/>
+      </w:r>
+      <w:r>
+        <w:rPr>
+          <w:rFonts w:ascii="Garamond" w:hAnsi="Garamond"/>
+          <w:bCs/>
+          <w:i/>
+          <w:color w:val="auto"/>
+        </w:rPr>
+        <w:t>Remote</w:t>
       </w:r>
     </w:p>
     <w:p>
@@ -3262,21 +3215,7 @@
           <w:sz w:val="18"/>
           <w:szCs w:val="18"/>
         </w:rPr>
-        <w:t>"</w:t>
-      </w:r>
-      <w:r>
-        <w:rPr>
-          <w:sz w:val="18"/>
-          <w:szCs w:val="18"/>
-        </w:rPr>
-        <w:t xml:space="preserve">, </w:t>
-      </w:r>
-      <w:r>
-        <w:rPr>
-          <w:sz w:val="18"/>
-          <w:szCs w:val="18"/>
-        </w:rPr>
-        <w:t>"</w:t>
+        <w:t>", "</w:t>
       </w:r>
       <w:hyperlink r:id="rId12" w:history="1">
         <w:r>

</xml_diff>